<commit_message>
Rename program to "Citizen AI Program" throughout
Drop "Developer"/"Engineer" from the program name across course
content, the reference doc, and the SharePoint site (site title,
8 pages, the Policies & Procedures doc, and the Final Exam Form
title updated live). Also removed an orphaned duplicate "Day 1
Quick Start" page that wasn't linked from Home.

Co-Authored-By: Claude Opus 4.7 (1M context) <noreply@anthropic.com>
</commit_message>
<xml_diff>
--- a/Citizen_AI_Program_Bible.docx
+++ b/Citizen_AI_Program_Bible.docx
@@ -13,7 +13,7 @@
           <w:bCs/>
           <w:color w:val="000D2D"/>
         </w:rPr>
-        <w:t xml:space="preserve">Citizen AI Developer Program</w:t>
+        <w:t>Citizen AI Program</w:t>
       </w:r>
     </w:p>
     <w:p>
@@ -27,7 +27,7 @@
           <w:iCs/>
           <w:color w:val="0042E0"/>
         </w:rPr>
-        <w:t xml:space="preserve">The single source of truth for Helm’s Citizen AI Developer Program — onboarding, certification, and continuing education</w:t>
+        <w:t>The single source of truth for Helm’s Citizen AI Program — onboarding, certification, and continuing education</w:t>
       </w:r>
     </w:p>
     <w:p>
@@ -199,7 +199,7 @@
         <w:pStyle w:val="FirstParagraph"/>
       </w:pPr>
       <w:r>
-        <w:t xml:space="preserve">This document is the operating reference for the Citizen AI Developer Program — everything after initial certification. It complements, not replaces, the course itself (hosted on SharePoint at</w:t>
+        <w:t>This document is the operating reference for the Citizen AI Program — everything after initial certification. It complements, not replaces, the course itself (hosted on SharePoint at</w:t>
       </w:r>
       <w:r>
         <w:t xml:space="preserve"> </w:t>
@@ -2937,7 +2937,7 @@
         <w:t xml:space="preserve"> </w:t>
       </w:r>
       <w:r>
-        <w:t xml:space="preserve">- Revocation: remove the Entra app assignment and remove from the GitHub citizen team. See the Citizen AI Engineer Policies &amp; Procedures document for the full offboarding checklist.</w:t>
+        <w:t>- Revocation: remove the Entra app assignment and remove from the GitHub citizen team. See the Citizen AI Policies &amp; Procedures document for the full offboarding checklist.</w:t>
       </w:r>
     </w:p>
     <w:p>

</xml_diff>

<commit_message>
Add quarterly 1:1 agenda template and tracker
- 1on1_agenda_template.md: live-use scratch page for the four-step
  1:1 structure (self-assessment, Highlander review, capability
  check-in, goal-setting) already documented in the Program Bible
- citizen_1on1_tracker.csv: system of record, one row per citizen
  per quarter
- Update Bible Section 5/6 to reference both and drop the
  pre-submitted self-assessment framing (decided to ask live instead)

Co-Authored-By: Claude Opus 4.7 (1M context) <noreply@anthropic.com>
</commit_message>
<xml_diff>
--- a/Citizen_AI_Program_Bible.docx
+++ b/Citizen_AI_Program_Bible.docx
@@ -2308,13 +2308,13 @@
           <w:b/>
           <w:bCs/>
         </w:rPr>
-        <w:t xml:space="preserve">Pre-1:1 self-assessment</w:t>
+        <w:t>Self-assessment, asked live</w:t>
       </w:r>
       <w:r>
         <w:t xml:space="preserve"> </w:t>
       </w:r>
       <w:r>
-        <w:t xml:space="preserve">(citizen fills out beforehand): what did you build this quarter, what’s blocking you, what do you want to learn next</w:t>
+        <w:t>(no pre-submitted form): what did you build this quarter, what’s blocking you, what do you want to learn next</w:t>
       </w:r>
     </w:p>
     <w:p>
@@ -2397,6 +2397,20 @@
     </w:p>
     <w:p>
       <w:pPr>
+        <w:pStyle w:val="FirstParagraph"/>
+      </w:pPr>
+      <w:r>
+        <w:rPr>
+          <w:b/>
+          <w:bCs/>
+        </w:rPr>
+        <w:t>Built: 1on1_agenda_template.md (repo root) — a live scratch page with the four prompts above, used during the call. citizen_1on1_tracker.csv (repo root) — the system of record, one row per citizen per quarter (Name, Email, Quarter, Date, What They Built, Blocker, Capability Level, Goal Set, Prior Goal Status, Notes). Fill in the agenda template live, then transcribe it into one tracker row after the call.</w:t>
+      </w:r>
+      <w:r/>
+      <w:r/>
+    </w:p>
+    <w:p>
+      <w:pPr>
         <w:pStyle w:val="BodyText"/>
       </w:pPr>
       <w:r>
@@ -2410,7 +2424,7 @@
         <w:t xml:space="preserve"> </w:t>
       </w:r>
       <w:r>
-        <w:t xml:space="preserve">— these are private coaching conversations. Action items from each 1:1 should be logged somewhere lightweight (a simple tracker, not a full recording) so follow-through can be checked at the next 1:1.</w:t>
+        <w:t>— these are private coaching conversations. The tracker captures the outcome (goal set, status, one-line notes), not a transcript.</w:t>
       </w:r>
     </w:p>
     <w:p>
@@ -2524,7 +2538,7 @@
         <w:t xml:space="preserve"> </w:t>
       </w:r>
       <w:r>
-        <w:t xml:space="preserve">- 1:1 Prep Resources — the self-assessment template, for admin use</w:t>
+        <w:t>- 1:1 Prep Resources — link to 1on1_agenda_template.md and citizen_1on1_tracker.csv (Section 5), for admin use</w:t>
       </w:r>
     </w:p>
     <w:p>

</xml_diff>

<commit_message>
Point 1:1 scripts and docs at the SharePoint list, not the removed CSV
Companion commit to ce4bf13 (which removed citizen_1on1_tracker.csv).
citizen_1on1_prep.js and citizen_1on1_log.js now read/write the
"1on1 Tracker" SharePoint list (id 1837443e-f712-456f-bc81-fc3ddbf7da4d)
instead of a local CSV — same restricted-permissions pattern as the
Program Admin library. Also fixes a real bug: prep's date was computed
via toISOString() (UTC), reporting tomorrow's date in the evening in
US timezones — now uses local date components. Doc folders nest under
Program Admin/1on1 Notes/ instead of the library root. Updated the
agenda template and Program Bible to match. Validated end-to-end with
a test list item + doc, since removed.

Co-Authored-By: Claude Opus 4.7 (1M context) <noreply@anthropic.com>
</commit_message>
<xml_diff>
--- a/Citizen_AI_Program_Bible.docx
+++ b/Citizen_AI_Program_Bible.docx
@@ -2404,7 +2404,7 @@
           <w:b/>
           <w:bCs/>
         </w:rPr>
-        <w:t>Built: 1on1_agenda_template.md (repo root) — a live scratch page with the four prompts above, used during the call. citizen_1on1_tracker.csv (repo root) — the system of record, one row per citizen per quarter (Name, Email, Quarter, Date, What They Built, Blocker, Capability Level, Goal Set, Prior Goal Status, Notes). Fill in the agenda template live, then transcribe it into one tracker row after the call.</w:t>
+        <w:t>Built: 1on1_agenda_template.md (repo root) — a live scratch page with the four prompts above, used during the call. /citizen-1on1-prep [name] opens it pre-filled with the citizen's prior goal. /citizen-1on1-log [name] takes your notes or a transcript afterward and logs it — one item in the restricted “1on1 Tracker” SharePoint list (Name, Email, Quarter, Date, What They Built, Blocker, Capability Level, Goal Set, Prior Goal Status, Notes) plus a one-page docx filed under Program Admin/1on1 Notes/&lt;Name&gt;/ in SharePoint. Both the list and the library have broken permission inheritance, granted only to the Owners group — citizens can never see any of this.</w:t>
       </w:r>
       <w:r/>
       <w:r/>
@@ -2538,7 +2538,7 @@
         <w:t xml:space="preserve"> </w:t>
       </w:r>
       <w:r>
-        <w:t>- 1:1 Prep Resources — link to 1on1_agenda_template.md and citizen_1on1_tracker.csv (Section 5), for admin use</w:t>
+        <w:t>- 1:1 Prep Resources — restricted admin-only SharePoint page pointing to /citizen-1on1-prep and /citizen-1on1-log (Section 5); not linked from this citizen-facing hub</w:t>
       </w:r>
     </w:p>
     <w:p>

</xml_diff>

<commit_message>
Remove monthly mandatory sessions and Feature Spotlight Index
Continuing education cadence is now weekly office hours + quarterly
1:1s only. Renumbered Bible sections accordingly, fixed a stale Day 1
Quick Start reference to the already-removed agreement-signing step,
and fixed the 1:1 doc-folder path text to reflect team-nesting
(missed in an earlier pass). Deleted the live "Monthly Session
Library" and "Feature Spotlight Index" SharePoint pages (both empty,
no real content) and updated the Continuing Education Hub page to
match.

Co-Authored-By: Claude Opus 4.7 (1M context) <noreply@anthropic.com>
</commit_message>
<xml_diff>
--- a/Citizen_AI_Program_Bible.docx
+++ b/Citizen_AI_Program_Bible.docx
@@ -100,18 +100,6 @@
       </w:pPr>
       <w:r>
         <w:t xml:space="preserve">Continuing Education — Weekly Office Hours</w:t>
-      </w:r>
-    </w:p>
-    <w:p>
-      <w:pPr>
-        <w:pStyle w:val="Compact"/>
-        <w:numPr>
-          <w:ilvl w:val="0"/>
-          <w:numId w:val="1001"/>
-        </w:numPr>
-      </w:pPr>
-      <w:r>
-        <w:t xml:space="preserve">Continuing Education — Monthly Mandatory Sessions</w:t>
       </w:r>
     </w:p>
     <w:p>
@@ -522,7 +510,7 @@
         <w:t xml:space="preserve"> </w:t>
       </w:r>
       <w:r>
-        <w:t xml:space="preserve">The 16-module course and certification (Section 2) address Knowledge and Ability. Everything in this document — office hours, monthly sessions, quarterly 1:1s — addresses Reinforcement. Without it, ADKAR predicts exactly what happens: initial enthusiasm fades, old habits return, no accountability structure remains.</w:t>
+        <w:t>The 16-module course and certification (Section 2) address Knowledge and Ability. Everything in this document — weekly office hours and quarterly 1:1s — addresses Reinforcement. Without it, ADKAR predicts exactly what happens: initial enthusiasm fades, old habits return, no accountability structure remains.</w:t>
       </w:r>
     </w:p>
     <w:p>
@@ -752,7 +740,7 @@
               <w:pStyle w:val="Compact"/>
             </w:pPr>
             <w:r>
-              <w:t xml:space="preserve">Sign the Citizen Developer Agreement, sign in via SSO (Microsoft Entra provisions the Claude Enterprise account automatically — no invite email, no manual request), set up first Project, create first GitHub repo</w:t>
+              <w:t>Sign in via SSO (Microsoft Entra provisions the Claude Enterprise account automatically — no invite email, no manual request), set up first Project, create first GitHub repo</w:t>
             </w:r>
           </w:p>
         </w:tc>
@@ -1799,7 +1787,7 @@
         <w:t xml:space="preserve">/citizen-ai-check-bulk</w:t>
       </w:r>
       <w:r>
-        <w:t xml:space="preserve">) — see Section 7.</w:t>
+        <w:t>) — see Section 6.</w:t>
       </w:r>
     </w:p>
     <w:p>
@@ -2090,7 +2078,7 @@
         <w:t xml:space="preserve"> </w:t>
       </w:r>
       <w:r>
-        <w:t xml:space="preserve">- Recorded (raw recording is sufficient, no production polish needed) and posted to the Content Library (Section 6)</w:t>
+        <w:t>- Recorded (raw recording is sufficient, no production polish needed) and posted to the Content Library (Section 5)</w:t>
       </w:r>
     </w:p>
     <w:p>
@@ -2102,6 +2090,8 @@
     </w:p>
     <w:bookmarkEnd w:id="13"/>
     <w:bookmarkStart w:id="14" w:name="X78cb6b4503c12b8f7d1b346ed6a89eceaf98cfa"/>
+    <w:bookmarkEnd w:id="14"/>
+    <w:bookmarkStart w:id="15" w:name="continuing-education-quarterly-11s"/>
     <w:p>
       <w:pPr>
         <w:pStyle w:val="Heading2"/>
@@ -2110,7 +2100,7 @@
         <w:rPr>
           <w:color w:val="000D2D"/>
         </w:rPr>
-        <w:t xml:space="preserve">4. Continuing Education — Monthly Mandatory Sessions</w:t>
+        <w:t>4. Continuing Education — Quarterly 1:1s</w:t>
       </w:r>
     </w:p>
     <w:p>
@@ -2128,158 +2118,6 @@
         <w:t xml:space="preserve"> </w:t>
       </w:r>
       <w:r>
-        <w:t xml:space="preserve">structured reinforcement. This is the ADKAR</w:t>
-      </w:r>
-      <w:r>
-        <w:t xml:space="preserve"> </w:t>
-      </w:r>
-      <w:r>
-        <w:t xml:space="preserve">“Reinforcement”</w:t>
-      </w:r>
-      <w:r>
-        <w:t xml:space="preserve"> </w:t>
-      </w:r>
-      <w:r>
-        <w:t xml:space="preserve">pillar in practice — mandatory because the program’s value depends on the change actually sticking, not just training happening once.</w:t>
-      </w:r>
-    </w:p>
-    <w:p>
-      <w:pPr>
-        <w:pStyle w:val="BodyText"/>
-      </w:pPr>
-      <w:r>
-        <w:rPr>
-          <w:b/>
-          <w:bCs/>
-        </w:rPr>
-        <w:t xml:space="preserve">Format:</w:t>
-      </w:r>
-      <w:r>
-        <w:t xml:space="preserve"> </w:t>
-      </w:r>
-      <w:r>
-        <w:t xml:space="preserve">ownership rotates so it doesn’t become a lecture series —</w:t>
-      </w:r>
-    </w:p>
-    <w:p>
-      <w:pPr>
-        <w:pStyle w:val="Compact"/>
-        <w:numPr>
-          <w:ilvl w:val="0"/>
-          <w:numId w:val="1002"/>
-        </w:numPr>
-      </w:pPr>
-      <w:r>
-        <w:t xml:space="preserve">One month: program-lead-led deep dive on an advanced topic</w:t>
-      </w:r>
-    </w:p>
-    <w:p>
-      <w:pPr>
-        <w:pStyle w:val="Compact"/>
-        <w:numPr>
-          <w:ilvl w:val="0"/>
-          <w:numId w:val="1002"/>
-        </w:numPr>
-      </w:pPr>
-      <w:r>
-        <w:t xml:space="preserve">One month: citizen presents a real project (peer learning — the best prompter on the team makes everyone better)</w:t>
-      </w:r>
-    </w:p>
-    <w:p>
-      <w:pPr>
-        <w:pStyle w:val="Compact"/>
-        <w:numPr>
-          <w:ilvl w:val="0"/>
-          <w:numId w:val="1002"/>
-        </w:numPr>
-      </w:pPr>
-      <w:r>
-        <w:t xml:space="preserve">One month: cross-team panel (e.g., Sales and CS comparing how they each use Claude)</w:t>
-      </w:r>
-    </w:p>
-    <w:p>
-      <w:pPr>
-        <w:pStyle w:val="Compact"/>
-        <w:numPr>
-          <w:ilvl w:val="0"/>
-          <w:numId w:val="1002"/>
-        </w:numPr>
-      </w:pPr>
-      <w:r>
-        <w:t xml:space="preserve">Periodically: a Highlander metrics review, showing the cohort its own aggregate impact — this tends to land better than any external motivational content, because it’s their own data</w:t>
-      </w:r>
-    </w:p>
-    <w:p>
-      <w:pPr>
-        <w:pStyle w:val="Compact"/>
-        <w:numPr>
-          <w:ilvl w:val="0"/>
-          <w:numId w:val="1002"/>
-        </w:numPr>
-      </w:pPr>
-      <w:r>
-        <w:t xml:space="preserve">As needed: safety/zone-framework refreshers, especially after any incident or policy update</w:t>
-      </w:r>
-    </w:p>
-    <w:p>
-      <w:pPr>
-        <w:pStyle w:val="FirstParagraph"/>
-      </w:pPr>
-      <w:r>
-        <w:rPr>
-          <w:b/>
-          <w:bCs/>
-        </w:rPr>
-        <w:t xml:space="preserve">Mechanics:</w:t>
-      </w:r>
-      <w:r>
-        <w:t xml:space="preserve"> </w:t>
-      </w:r>
-      <w:r>
-        <w:t xml:space="preserve">- Mandatory attendance, tracked</w:t>
-      </w:r>
-      <w:r>
-        <w:t xml:space="preserve"> </w:t>
-      </w:r>
-      <w:r>
-        <w:t xml:space="preserve">- Recorded and posted to the Content Library — this is the primary way someone who missed a mandatory session catches up, so recording quality (audio especially) matters more here than for office hours</w:t>
-      </w:r>
-    </w:p>
-    <w:p>
-      <w:r>
-        <w:pict>
-          <v:rect style="width:0;height:1.5pt" o:hralign="center" o:hrstd="t" o:hr="t"/>
-        </w:pict>
-      </w:r>
-    </w:p>
-    <w:bookmarkEnd w:id="14"/>
-    <w:bookmarkStart w:id="15" w:name="continuing-education-quarterly-11s"/>
-    <w:p>
-      <w:pPr>
-        <w:pStyle w:val="Heading2"/>
-      </w:pPr>
-      <w:r>
-        <w:rPr>
-          <w:color w:val="000D2D"/>
-        </w:rPr>
-        <w:t xml:space="preserve">5. Continuing Education — Quarterly 1:1s</w:t>
-      </w:r>
-    </w:p>
-    <w:p>
-      <w:pPr>
-        <w:pStyle w:val="FirstParagraph"/>
-      </w:pPr>
-      <w:r>
-        <w:rPr>
-          <w:b/>
-          <w:bCs/>
-        </w:rPr>
-        <w:t xml:space="preserve">Purpose:</w:t>
-      </w:r>
-      <w:r>
-        <w:t xml:space="preserve"> </w:t>
-      </w:r>
-      <w:r>
         <w:t xml:space="preserve">individual coaching, not a performance review. The goal is unblocking and goal-setting, tied to the citizen’s own OKR-linked work.</w:t>
       </w:r>
     </w:p>
@@ -2404,7 +2242,7 @@
           <w:b/>
           <w:bCs/>
         </w:rPr>
-        <w:t>Built: 1on1_agenda_template.md (repo root) — a live scratch page with the four prompts above, used during the call. /citizen-1on1-prep [name] opens it pre-filled with the citizen's prior goal. /citizen-1on1-log [name] takes your notes or a transcript afterward and logs it — one item in the restricted “1on1 Tracker” SharePoint list (Name, Email, Quarter, Date, What They Built, Blocker, Capability Level, Goal Set, Prior Goal Status, Notes) plus a one-page docx filed under Program Admin/1on1 Notes/&lt;Name&gt;/ in SharePoint. Both the list and the library have broken permission inheritance, granted only to the Owners group — citizens can never see any of this.</w:t>
+        <w:t>Built: 1on1_agenda_template.md (repo root) — a live scratch page with the four prompts above, used during the call. /citizen-1on1-prep [name] opens it pre-filled with the citizen's prior goal. /citizen-1on1-log [name] takes your notes or a transcript afterward and logs it — one item in the restricted “1on1 Tracker” SharePoint list (Name, Email, Quarter, Date, What They Built, Blocker, Capability Level, Goal Set, Prior Goal Status, Notes) plus a one-page docx filed under Program Admin/1on1 Notes/&lt;Team&gt;/&lt;Name&gt;/ (team looked up from citizen_roster.json) in SharePoint. Both the list and the library have broken permission inheritance, granted only to the Owners group — citizens can never see any of this.</w:t>
       </w:r>
       <w:r/>
       <w:r/>
@@ -2444,7 +2282,7 @@
         <w:rPr>
           <w:color w:val="000D2D"/>
         </w:rPr>
-        <w:t xml:space="preserve">6. Content Library and Recordings</w:t>
+        <w:t>5. Content Library and Recordings</w:t>
       </w:r>
     </w:p>
     <w:p>
@@ -2514,32 +2352,16 @@
           <w:b/>
           <w:bCs/>
         </w:rPr>
-        <w:t xml:space="preserve">Proposed structure under the hub:</w:t>
-      </w:r>
-      <w:r>
-        <w:t xml:space="preserve"> </w:t>
-      </w:r>
-      <w:r>
-        <w:t xml:space="preserve">- Office Hours Archive — recordings by date, lightly tagged by topic</w:t>
-      </w:r>
-      <w:r>
-        <w:t xml:space="preserve"> </w:t>
-      </w:r>
-      <w:r>
-        <w:t xml:space="preserve">- Monthly Session Library — recordings, with the citizen-presented sessions given equal visibility to program-lead-led ones</w:t>
-      </w:r>
-      <w:r>
-        <w:t xml:space="preserve"> </w:t>
-      </w:r>
-      <w:r>
-        <w:t xml:space="preserve">- Feature Spotlight Index — a running list of which advanced capability was covered when, cross-linked to the relevant course module (e.g., the Extended Thinking spotlight links back to Module 8)</w:t>
-      </w:r>
-      <w:r>
-        <w:t xml:space="preserve"> </w:t>
-      </w:r>
-      <w:r>
-        <w:t>- 1:1 Prep Resources — restricted admin-only SharePoint page pointing to /citizen-1on1-prep and /citizen-1on1-log (Section 5); not linked from this citizen-facing hub</w:t>
-      </w:r>
+        <w:t>Structure under the hub: - Office Hours Archive — recordings by date, lightly tagged by topic - 1:1 Prep Resources — restricted admin-only SharePoint page pointing to /citizen-1on1-prep and /citizen-1on1-log (Section 4); not linked from this citizen-facing hub</w:t>
+      </w:r>
+      <w:r/>
+      <w:r/>
+      <w:r/>
+      <w:r/>
+      <w:r/>
+      <w:r/>
+      <w:r/>
+      <w:r/>
     </w:p>
     <w:p>
       <w:pPr>
@@ -2550,7 +2372,7 @@
           <w:b/>
           <w:bCs/>
         </w:rPr>
-        <w:t xml:space="preserve">Not yet built</w:t>
+        <w:t>Built — live on the Helm SharePoint site, linked from Home.</w:t>
       </w:r>
       <w:r>
         <w:t xml:space="preserve"> </w:t>
@@ -2576,7 +2398,7 @@
         <w:rPr>
           <w:color w:val="000D2D"/>
         </w:rPr>
-        <w:t xml:space="preserve">7. Tools and Infrastructure</w:t>
+        <w:t>6. Tools and Infrastructure</w:t>
       </w:r>
     </w:p>
     <w:tbl>
@@ -2927,7 +2749,7 @@
         <w:rPr>
           <w:color w:val="000D2D"/>
         </w:rPr>
-        <w:t xml:space="preserve">8. Program Governance</w:t>
+        <w:t>7. Program Governance</w:t>
       </w:r>
     </w:p>
     <w:p>
@@ -3025,7 +2847,7 @@
         <w:rPr>
           <w:color w:val="000D2D"/>
         </w:rPr>
-        <w:t xml:space="preserve">9. Change Log</w:t>
+        <w:t>8. Change Log</w:t>
       </w:r>
     </w:p>
     <w:tbl>
@@ -3114,6 +2936,28 @@
             </w:pPr>
             <w:r>
               <w:t xml:space="preserve">Initial version — program overview, continuing education cadence, tools, and governance</w:t>
+            </w:r>
+          </w:p>
+        </w:tc>
+      </w:tr>
+      <w:tr>
+        <w:tc>
+          <w:tcPr>
+            <w:tcW w:type="dxa" w:w="3960"/>
+          </w:tcPr>
+          <w:p>
+            <w:r>
+              <w:t>2026-07-30</w:t>
+            </w:r>
+          </w:p>
+        </w:tc>
+        <w:tc>
+          <w:tcPr>
+            <w:tcW w:type="dxa" w:w="3960"/>
+          </w:tcPr>
+          <w:p>
+            <w:r>
+              <w:t>Removed monthly mandatory sessions and the Feature Spotlight Index — continuing education cadence is now weekly office hours + quarterly 1:1s only. Fixed a stale Day 1 reference to the removed agreement-signing step.</w:t>
             </w:r>
           </w:p>
         </w:tc>

</xml_diff>